<commit_message>
v434.0.0: Aktenausgabe und Rechtsstand konsolidieren
</commit_message>
<xml_diff>
--- a/testakten/bgb-bt-smart-kuehlschrank-digital-repair-koeln/docx/reparaturprotokoll-puetz.docx
+++ b/testakten/bgb-bt-smart-kuehlschrank-digital-repair-koeln/docx/reparaturprotokoll-puetz.docx
@@ -4,30 +4,1309 @@
   <w:body>
     <w:p>
       <w:pPr>
+        <w:jc w:val="center"/>
+      </w:pPr>
+      <w:r>
+        <w:rPr>
+          <w:b/>
+          <w:color w:val="23364D"/>
+          <w:sz w:val="30"/>
+        </w:rPr>
+        <w:t>KÄLTEWERKSTATT PÜTZ &amp; SÖHNE</w:t>
+      </w:r>
+    </w:p>
+    <w:p>
+      <w:pPr>
+        <w:jc w:val="center"/>
+      </w:pPr>
+      <w:r>
+        <w:rPr>
+          <w:sz w:val="18"/>
+        </w:rPr>
+        <w:t>Kälteanlagenbau | Haushaltskälte | Werkskundendienst</w:t>
+      </w:r>
+    </w:p>
+    <w:p>
+      <w:pPr>
+        <w:jc w:val="center"/>
+      </w:pPr>
+      <w:r>
+        <w:rPr>
+          <w:sz w:val="17"/>
+        </w:rPr>
+        <w:t>Niehler Straße 214 | 50733 Köln | Telefon 0221 778491-0 | werkstatt@puetz-kaelte.de</w:t>
+      </w:r>
+    </w:p>
+    <w:p>
+      <w:pPr>
+        <w:pStyle w:val="Title"/>
+      </w:pPr>
+      <w:r>
+        <w:t>Reparatur- und Diagnoseprotokoll VestaCool FR-900</w:t>
+      </w:r>
+    </w:p>
+    <w:tbl>
+      <w:tblPr>
+        <w:tblStyle w:val="TableGrid"/>
+        <w:tblW w:type="auto" w:w="0"/>
+        <w:jc w:val="center"/>
+        <w:tblLayout w:type="fixed"/>
+        <w:tblLook w:firstColumn="1" w:firstRow="1" w:lastColumn="0" w:lastRow="0" w:noHBand="0" w:noVBand="1" w:val="04A0"/>
+      </w:tblPr>
+      <w:tblGrid>
+        <w:gridCol w:w="4762"/>
+        <w:gridCol w:w="4762"/>
+      </w:tblGrid>
+      <w:tr>
+        <w:trPr>
+          <w:cantSplit/>
+        </w:trPr>
+        <w:tc>
+          <w:tcPr>
+            <w:tcW w:type="dxa" w:w="2494"/>
+            <w:vAlign w:val="top"/>
+            <w:tcMar>
+              <w:top w:w="90" w:type="dxa"/>
+              <w:start w:w="90" w:type="dxa"/>
+              <w:bottom w:w="90" w:type="dxa"/>
+              <w:end w:w="90" w:type="dxa"/>
+            </w:tcMar>
+          </w:tcPr>
+          <w:p>
+            <w:r>
+              <w:rPr>
+                <w:rFonts w:ascii="Times New Roman" w:hAnsi="Times New Roman"/>
+                <w:b/>
+                <w:sz w:val="19"/>
+              </w:rPr>
+              <w:t>Kundin</w:t>
+            </w:r>
+          </w:p>
+        </w:tc>
+        <w:tc>
+          <w:tcPr>
+            <w:tcW w:type="dxa" w:w="6463"/>
+            <w:vAlign w:val="top"/>
+            <w:tcMar>
+              <w:top w:w="90" w:type="dxa"/>
+              <w:start w:w="90" w:type="dxa"/>
+              <w:bottom w:w="90" w:type="dxa"/>
+              <w:end w:w="90" w:type="dxa"/>
+            </w:tcMar>
+          </w:tcPr>
+          <w:p>
+            <w:r>
+              <w:rPr>
+                <w:rFonts w:ascii="Times New Roman" w:hAnsi="Times New Roman"/>
+                <w:sz w:val="19"/>
+              </w:rPr>
+              <w:t>Amalie von Reichenbach, Rheinufer 14, 50668 Köln</w:t>
+            </w:r>
+          </w:p>
+        </w:tc>
+      </w:tr>
+      <w:tr>
+        <w:trPr>
+          <w:cantSplit/>
+        </w:trPr>
+        <w:tc>
+          <w:tcPr>
+            <w:tcW w:type="dxa" w:w="2494"/>
+            <w:vAlign w:val="top"/>
+            <w:tcMar>
+              <w:top w:w="90" w:type="dxa"/>
+              <w:start w:w="90" w:type="dxa"/>
+              <w:bottom w:w="90" w:type="dxa"/>
+              <w:end w:w="90" w:type="dxa"/>
+            </w:tcMar>
+          </w:tcPr>
+          <w:p>
+            <w:r>
+              <w:rPr>
+                <w:rFonts w:ascii="Times New Roman" w:hAnsi="Times New Roman"/>
+                <w:b/>
+                <w:sz w:val="19"/>
+              </w:rPr>
+              <w:t>Gerät</w:t>
+            </w:r>
+          </w:p>
+        </w:tc>
+        <w:tc>
+          <w:tcPr>
+            <w:tcW w:type="dxa" w:w="6463"/>
+            <w:vAlign w:val="top"/>
+            <w:tcMar>
+              <w:top w:w="90" w:type="dxa"/>
+              <w:start w:w="90" w:type="dxa"/>
+              <w:bottom w:w="90" w:type="dxa"/>
+              <w:end w:w="90" w:type="dxa"/>
+            </w:tcMar>
+          </w:tcPr>
+          <w:p>
+            <w:r>
+              <w:rPr>
+                <w:rFonts w:ascii="Times New Roman" w:hAnsi="Times New Roman"/>
+                <w:sz w:val="19"/>
+              </w:rPr>
+              <w:t>VestaCool FR-900, Seriennummer VCFR9-DE-22104-55</w:t>
+            </w:r>
+          </w:p>
+        </w:tc>
+      </w:tr>
+      <w:tr>
+        <w:trPr>
+          <w:cantSplit/>
+        </w:trPr>
+        <w:tc>
+          <w:tcPr>
+            <w:tcW w:type="dxa" w:w="2494"/>
+            <w:vAlign w:val="top"/>
+            <w:tcMar>
+              <w:top w:w="90" w:type="dxa"/>
+              <w:start w:w="90" w:type="dxa"/>
+              <w:bottom w:w="90" w:type="dxa"/>
+              <w:end w:w="90" w:type="dxa"/>
+            </w:tcMar>
+          </w:tcPr>
+          <w:p>
+            <w:r>
+              <w:rPr>
+                <w:rFonts w:ascii="Times New Roman" w:hAnsi="Times New Roman"/>
+                <w:b/>
+                <w:sz w:val="19"/>
+              </w:rPr>
+              <w:t>Termin</w:t>
+            </w:r>
+          </w:p>
+        </w:tc>
+        <w:tc>
+          <w:tcPr>
+            <w:tcW w:type="dxa" w:w="6463"/>
+            <w:vAlign w:val="top"/>
+            <w:tcMar>
+              <w:top w:w="90" w:type="dxa"/>
+              <w:start w:w="90" w:type="dxa"/>
+              <w:bottom w:w="90" w:type="dxa"/>
+              <w:end w:w="90" w:type="dxa"/>
+            </w:tcMar>
+          </w:tcPr>
+          <w:p>
+            <w:r>
+              <w:rPr>
+                <w:rFonts w:ascii="Times New Roman" w:hAnsi="Times New Roman"/>
+                <w:sz w:val="19"/>
+              </w:rPr>
+              <w:t>3. Mai 2026, 09:12 Uhr bis 11:06 Uhr</w:t>
+            </w:r>
+          </w:p>
+        </w:tc>
+      </w:tr>
+      <w:tr>
+        <w:trPr>
+          <w:cantSplit/>
+        </w:trPr>
+        <w:tc>
+          <w:tcPr>
+            <w:tcW w:type="dxa" w:w="2494"/>
+            <w:vAlign w:val="top"/>
+            <w:tcMar>
+              <w:top w:w="90" w:type="dxa"/>
+              <w:start w:w="90" w:type="dxa"/>
+              <w:bottom w:w="90" w:type="dxa"/>
+              <w:end w:w="90" w:type="dxa"/>
+            </w:tcMar>
+          </w:tcPr>
+          <w:p>
+            <w:r>
+              <w:rPr>
+                <w:rFonts w:ascii="Times New Roman" w:hAnsi="Times New Roman"/>
+                <w:b/>
+                <w:sz w:val="19"/>
+              </w:rPr>
+              <w:t>Techniker</w:t>
+            </w:r>
+          </w:p>
+        </w:tc>
+        <w:tc>
+          <w:tcPr>
+            <w:tcW w:type="dxa" w:w="6463"/>
+            <w:vAlign w:val="top"/>
+            <w:tcMar>
+              <w:top w:w="90" w:type="dxa"/>
+              <w:start w:w="90" w:type="dxa"/>
+              <w:bottom w:w="90" w:type="dxa"/>
+              <w:end w:w="90" w:type="dxa"/>
+            </w:tcMar>
+          </w:tcPr>
+          <w:p>
+            <w:r>
+              <w:rPr>
+                <w:rFonts w:ascii="Times New Roman" w:hAnsi="Times New Roman"/>
+                <w:sz w:val="19"/>
+              </w:rPr>
+              <w:t>Gregor Pütz, Kälteanlagenbauermeister</w:t>
+            </w:r>
+          </w:p>
+        </w:tc>
+      </w:tr>
+      <w:tr>
+        <w:trPr>
+          <w:cantSplit/>
+        </w:trPr>
+        <w:tc>
+          <w:tcPr>
+            <w:tcW w:type="dxa" w:w="2494"/>
+            <w:vAlign w:val="top"/>
+            <w:tcMar>
+              <w:top w:w="90" w:type="dxa"/>
+              <w:start w:w="90" w:type="dxa"/>
+              <w:bottom w:w="90" w:type="dxa"/>
+              <w:end w:w="90" w:type="dxa"/>
+            </w:tcMar>
+          </w:tcPr>
+          <w:p>
+            <w:r>
+              <w:rPr>
+                <w:rFonts w:ascii="Times New Roman" w:hAnsi="Times New Roman"/>
+                <w:b/>
+                <w:sz w:val="19"/>
+              </w:rPr>
+              <w:t>Auftrag</w:t>
+            </w:r>
+          </w:p>
+        </w:tc>
+        <w:tc>
+          <w:tcPr>
+            <w:tcW w:type="dxa" w:w="6463"/>
+            <w:vAlign w:val="top"/>
+            <w:tcMar>
+              <w:top w:w="90" w:type="dxa"/>
+              <w:start w:w="90" w:type="dxa"/>
+              <w:bottom w:w="90" w:type="dxa"/>
+              <w:end w:w="90" w:type="dxa"/>
+            </w:tcMar>
+          </w:tcPr>
+          <w:p>
+            <w:r>
+              <w:rPr>
+                <w:rFonts w:ascii="Times New Roman" w:hAnsi="Times New Roman"/>
+                <w:sz w:val="19"/>
+              </w:rPr>
+              <w:t>Temperaturschwankungen im Frischefach, Ausfall Eiswürfelmodul, Diagnose nach Aktualisierung</w:t>
+            </w:r>
+          </w:p>
+        </w:tc>
+      </w:tr>
+      <w:tr>
+        <w:trPr>
+          <w:cantSplit/>
+        </w:trPr>
+        <w:tc>
+          <w:tcPr>
+            <w:tcW w:type="dxa" w:w="2494"/>
+            <w:vAlign w:val="top"/>
+            <w:tcMar>
+              <w:top w:w="90" w:type="dxa"/>
+              <w:start w:w="90" w:type="dxa"/>
+              <w:bottom w:w="90" w:type="dxa"/>
+              <w:end w:w="90" w:type="dxa"/>
+            </w:tcMar>
+          </w:tcPr>
+          <w:p>
+            <w:r>
+              <w:rPr>
+                <w:rFonts w:ascii="Times New Roman" w:hAnsi="Times New Roman"/>
+                <w:b/>
+                <w:sz w:val="19"/>
+              </w:rPr>
+              <w:t>Arbeitsort</w:t>
+            </w:r>
+          </w:p>
+        </w:tc>
+        <w:tc>
+          <w:tcPr>
+            <w:tcW w:type="dxa" w:w="6463"/>
+            <w:vAlign w:val="top"/>
+            <w:tcMar>
+              <w:top w:w="90" w:type="dxa"/>
+              <w:start w:w="90" w:type="dxa"/>
+              <w:bottom w:w="90" w:type="dxa"/>
+              <w:end w:w="90" w:type="dxa"/>
+            </w:tcMar>
+          </w:tcPr>
+          <w:p>
+            <w:r>
+              <w:rPr>
+                <w:rFonts w:ascii="Times New Roman" w:hAnsi="Times New Roman"/>
+                <w:sz w:val="19"/>
+              </w:rPr>
+              <w:t>Küche der Kundin; anwesend bis 09:45 Uhr Hausmeister Ralf Kemper</w:t>
+            </w:r>
+          </w:p>
+        </w:tc>
+      </w:tr>
+    </w:tbl>
+    <w:p/>
+    <w:p>
+      <w:pPr>
         <w:pStyle w:val="Heading1"/>
       </w:pPr>
       <w:r>
-        <w:t>Reparaturprotokoll Pütz &amp; Söhne</w:t>
+        <w:t>1. Zustand bei Beginn</w:t>
       </w:r>
     </w:p>
     <w:p>
       <w:r>
-        <w:t>Kompressor läuft unregelmäßig an. ServicePort verweigert Diagnose mit Token refused. Ersatzteil-Pairing ohne VestaCool-Session nicht möglich.</w:t>
+        <w:t>Die Anzeige meldete für das Kühlfach 5 Grad Celsius und für das Frischefach 2 Grad Celsius. Das eingebrachte Vergleichsthermometer zeigte nach 25 Minuten im Frischefach 7,4 Grad Celsius. Im Auffangbereich des Eiswürfelmoduls befanden sich Schmelzwasserreste. Türdichtungen, Scharniere und Lüfter waren frei von sichtbaren Beschädigungen.</w:t>
+      </w:r>
+    </w:p>
+    <w:p>
+      <w:pPr>
+        <w:pStyle w:val="Heading1"/>
+      </w:pPr>
+      <w:r>
+        <w:t>2. Prüfschritte</w:t>
+      </w:r>
+    </w:p>
+    <w:tbl>
+      <w:tblPr>
+        <w:tblStyle w:val="TableGrid"/>
+        <w:tblW w:type="auto" w:w="0"/>
+        <w:jc w:val="center"/>
+        <w:tblLayout w:type="fixed"/>
+        <w:tblLook w:firstColumn="1" w:firstRow="1" w:lastColumn="0" w:lastRow="0" w:noHBand="0" w:noVBand="1" w:val="04A0"/>
+      </w:tblPr>
+      <w:tblGrid>
+        <w:gridCol w:w="3175"/>
+        <w:gridCol w:w="3175"/>
+        <w:gridCol w:w="3175"/>
+      </w:tblGrid>
+      <w:tr>
+        <w:trPr>
+          <w:tblHeader w:val="true"/>
+        </w:trPr>
+        <w:tc>
+          <w:tcPr>
+            <w:tcW w:type="dxa" w:w="1361"/>
+            <w:vAlign w:val="center"/>
+            <w:shd w:fill="DCE6EC"/>
+            <w:tcMar>
+              <w:top w:w="70" w:type="dxa"/>
+              <w:start w:w="70" w:type="dxa"/>
+              <w:bottom w:w="70" w:type="dxa"/>
+              <w:end w:w="70" w:type="dxa"/>
+            </w:tcMar>
+          </w:tcPr>
+          <w:p>
+            <w:r>
+              <w:rPr>
+                <w:rFonts w:ascii="Times New Roman" w:hAnsi="Times New Roman"/>
+                <w:b/>
+                <w:sz w:val="17"/>
+              </w:rPr>
+              <w:t>Uhrzeit</w:t>
+            </w:r>
+          </w:p>
+        </w:tc>
+        <w:tc>
+          <w:tcPr>
+            <w:tcW w:type="dxa" w:w="2608"/>
+            <w:vAlign w:val="center"/>
+            <w:shd w:fill="DCE6EC"/>
+            <w:tcMar>
+              <w:top w:w="70" w:type="dxa"/>
+              <w:start w:w="70" w:type="dxa"/>
+              <w:bottom w:w="70" w:type="dxa"/>
+              <w:end w:w="70" w:type="dxa"/>
+            </w:tcMar>
+          </w:tcPr>
+          <w:p>
+            <w:r>
+              <w:rPr>
+                <w:rFonts w:ascii="Times New Roman" w:hAnsi="Times New Roman"/>
+                <w:b/>
+                <w:sz w:val="17"/>
+              </w:rPr>
+              <w:t>Prüfung</w:t>
+            </w:r>
+          </w:p>
+        </w:tc>
+        <w:tc>
+          <w:tcPr>
+            <w:tcW w:type="dxa" w:w="4989"/>
+            <w:vAlign w:val="center"/>
+            <w:shd w:fill="DCE6EC"/>
+            <w:tcMar>
+              <w:top w:w="70" w:type="dxa"/>
+              <w:start w:w="70" w:type="dxa"/>
+              <w:bottom w:w="70" w:type="dxa"/>
+              <w:end w:w="70" w:type="dxa"/>
+            </w:tcMar>
+          </w:tcPr>
+          <w:p>
+            <w:r>
+              <w:rPr>
+                <w:rFonts w:ascii="Times New Roman" w:hAnsi="Times New Roman"/>
+                <w:b/>
+                <w:sz w:val="17"/>
+              </w:rPr>
+              <w:t>Messwert oder Feststellung</w:t>
+            </w:r>
+          </w:p>
+        </w:tc>
+      </w:tr>
+      <w:tr>
+        <w:trPr>
+          <w:cantSplit/>
+        </w:trPr>
+        <w:tc>
+          <w:tcPr>
+            <w:tcW w:type="dxa" w:w="1361"/>
+            <w:vAlign w:val="top"/>
+            <w:tcMar>
+              <w:top w:w="70" w:type="dxa"/>
+              <w:start w:w="70" w:type="dxa"/>
+              <w:bottom w:w="70" w:type="dxa"/>
+              <w:end w:w="70" w:type="dxa"/>
+            </w:tcMar>
+          </w:tcPr>
+          <w:p>
+            <w:r>
+              <w:rPr>
+                <w:rFonts w:ascii="Times New Roman" w:hAnsi="Times New Roman"/>
+                <w:sz w:val="17"/>
+              </w:rPr>
+              <w:t>09:28</w:t>
+            </w:r>
+          </w:p>
+        </w:tc>
+        <w:tc>
+          <w:tcPr>
+            <w:tcW w:type="dxa" w:w="2608"/>
+            <w:vAlign w:val="top"/>
+            <w:tcMar>
+              <w:top w:w="70" w:type="dxa"/>
+              <w:start w:w="70" w:type="dxa"/>
+              <w:bottom w:w="70" w:type="dxa"/>
+              <w:end w:w="70" w:type="dxa"/>
+            </w:tcMar>
+          </w:tcPr>
+          <w:p>
+            <w:r>
+              <w:rPr>
+                <w:rFonts w:ascii="Times New Roman" w:hAnsi="Times New Roman"/>
+                <w:sz w:val="17"/>
+              </w:rPr>
+              <w:t>Kompressoranlauf</w:t>
+            </w:r>
+          </w:p>
+        </w:tc>
+        <w:tc>
+          <w:tcPr>
+            <w:tcW w:type="dxa" w:w="4989"/>
+            <w:vAlign w:val="top"/>
+            <w:tcMar>
+              <w:top w:w="70" w:type="dxa"/>
+              <w:start w:w="70" w:type="dxa"/>
+              <w:bottom w:w="70" w:type="dxa"/>
+              <w:end w:w="70" w:type="dxa"/>
+            </w:tcMar>
+          </w:tcPr>
+          <w:p>
+            <w:r>
+              <w:rPr>
+                <w:rFonts w:ascii="Times New Roman" w:hAnsi="Times New Roman"/>
+                <w:sz w:val="17"/>
+              </w:rPr>
+              <w:t>Stromaufnahme 1,7 Ampere; Abschaltung nach 41 Sekunden; erneuter Anlauf nach 6 Minuten</w:t>
+            </w:r>
+          </w:p>
+        </w:tc>
+      </w:tr>
+      <w:tr>
+        <w:trPr>
+          <w:cantSplit/>
+        </w:trPr>
+        <w:tc>
+          <w:tcPr>
+            <w:tcW w:type="dxa" w:w="1361"/>
+            <w:vAlign w:val="top"/>
+            <w:tcMar>
+              <w:top w:w="70" w:type="dxa"/>
+              <w:start w:w="70" w:type="dxa"/>
+              <w:bottom w:w="70" w:type="dxa"/>
+              <w:end w:w="70" w:type="dxa"/>
+            </w:tcMar>
+          </w:tcPr>
+          <w:p>
+            <w:r>
+              <w:rPr>
+                <w:rFonts w:ascii="Times New Roman" w:hAnsi="Times New Roman"/>
+                <w:sz w:val="17"/>
+              </w:rPr>
+              <w:t>09:46</w:t>
+            </w:r>
+          </w:p>
+        </w:tc>
+        <w:tc>
+          <w:tcPr>
+            <w:tcW w:type="dxa" w:w="2608"/>
+            <w:vAlign w:val="top"/>
+            <w:tcMar>
+              <w:top w:w="70" w:type="dxa"/>
+              <w:start w:w="70" w:type="dxa"/>
+              <w:bottom w:w="70" w:type="dxa"/>
+              <w:end w:w="70" w:type="dxa"/>
+            </w:tcMar>
+          </w:tcPr>
+          <w:p>
+            <w:r>
+              <w:rPr>
+                <w:rFonts w:ascii="Times New Roman" w:hAnsi="Times New Roman"/>
+                <w:sz w:val="17"/>
+              </w:rPr>
+              <w:t>Temperaturfühler oben</w:t>
+            </w:r>
+          </w:p>
+        </w:tc>
+        <w:tc>
+          <w:tcPr>
+            <w:tcW w:type="dxa" w:w="4989"/>
+            <w:vAlign w:val="top"/>
+            <w:tcMar>
+              <w:top w:w="70" w:type="dxa"/>
+              <w:start w:w="70" w:type="dxa"/>
+              <w:bottom w:w="70" w:type="dxa"/>
+              <w:end w:w="70" w:type="dxa"/>
+            </w:tcMar>
+          </w:tcPr>
+          <w:p>
+            <w:r>
+              <w:rPr>
+                <w:rFonts w:ascii="Times New Roman" w:hAnsi="Times New Roman"/>
+                <w:sz w:val="17"/>
+              </w:rPr>
+              <w:t>Widerstandswert plausibel; Anzeige und Referenzwert weichen um 0,6 Grad ab</w:t>
+            </w:r>
+          </w:p>
+        </w:tc>
+      </w:tr>
+      <w:tr>
+        <w:trPr>
+          <w:cantSplit/>
+        </w:trPr>
+        <w:tc>
+          <w:tcPr>
+            <w:tcW w:type="dxa" w:w="1361"/>
+            <w:vAlign w:val="top"/>
+            <w:tcMar>
+              <w:top w:w="70" w:type="dxa"/>
+              <w:start w:w="70" w:type="dxa"/>
+              <w:bottom w:w="70" w:type="dxa"/>
+              <w:end w:w="70" w:type="dxa"/>
+            </w:tcMar>
+          </w:tcPr>
+          <w:p>
+            <w:r>
+              <w:rPr>
+                <w:rFonts w:ascii="Times New Roman" w:hAnsi="Times New Roman"/>
+                <w:sz w:val="17"/>
+              </w:rPr>
+              <w:t>10:03</w:t>
+            </w:r>
+          </w:p>
+        </w:tc>
+        <w:tc>
+          <w:tcPr>
+            <w:tcW w:type="dxa" w:w="2608"/>
+            <w:vAlign w:val="top"/>
+            <w:tcMar>
+              <w:top w:w="70" w:type="dxa"/>
+              <w:start w:w="70" w:type="dxa"/>
+              <w:bottom w:w="70" w:type="dxa"/>
+              <w:end w:w="70" w:type="dxa"/>
+            </w:tcMar>
+          </w:tcPr>
+          <w:p>
+            <w:r>
+              <w:rPr>
+                <w:rFonts w:ascii="Times New Roman" w:hAnsi="Times New Roman"/>
+                <w:sz w:val="17"/>
+              </w:rPr>
+              <w:t>Fühler Frischefach</w:t>
+            </w:r>
+          </w:p>
+        </w:tc>
+        <w:tc>
+          <w:tcPr>
+            <w:tcW w:type="dxa" w:w="4989"/>
+            <w:vAlign w:val="top"/>
+            <w:tcMar>
+              <w:top w:w="70" w:type="dxa"/>
+              <w:start w:w="70" w:type="dxa"/>
+              <w:bottom w:w="70" w:type="dxa"/>
+              <w:end w:w="70" w:type="dxa"/>
+            </w:tcMar>
+          </w:tcPr>
+          <w:p>
+            <w:r>
+              <w:rPr>
+                <w:rFonts w:ascii="Times New Roman" w:hAnsi="Times New Roman"/>
+                <w:sz w:val="17"/>
+              </w:rPr>
+              <w:t>Sprunghafte Werte zwischen 2,1 und 8,0 Grad bei unveränderter Referenztemperatur</w:t>
+            </w:r>
+          </w:p>
+        </w:tc>
+      </w:tr>
+      <w:tr>
+        <w:trPr>
+          <w:cantSplit/>
+        </w:trPr>
+        <w:tc>
+          <w:tcPr>
+            <w:tcW w:type="dxa" w:w="1361"/>
+            <w:vAlign w:val="top"/>
+            <w:tcMar>
+              <w:top w:w="70" w:type="dxa"/>
+              <w:start w:w="70" w:type="dxa"/>
+              <w:bottom w:w="70" w:type="dxa"/>
+              <w:end w:w="70" w:type="dxa"/>
+            </w:tcMar>
+          </w:tcPr>
+          <w:p>
+            <w:r>
+              <w:rPr>
+                <w:rFonts w:ascii="Times New Roman" w:hAnsi="Times New Roman"/>
+                <w:sz w:val="17"/>
+              </w:rPr>
+              <w:t>10:19</w:t>
+            </w:r>
+          </w:p>
+        </w:tc>
+        <w:tc>
+          <w:tcPr>
+            <w:tcW w:type="dxa" w:w="2608"/>
+            <w:vAlign w:val="top"/>
+            <w:tcMar>
+              <w:top w:w="70" w:type="dxa"/>
+              <w:start w:w="70" w:type="dxa"/>
+              <w:bottom w:w="70" w:type="dxa"/>
+              <w:end w:w="70" w:type="dxa"/>
+            </w:tcMar>
+          </w:tcPr>
+          <w:p>
+            <w:r>
+              <w:rPr>
+                <w:rFonts w:ascii="Times New Roman" w:hAnsi="Times New Roman"/>
+                <w:sz w:val="17"/>
+              </w:rPr>
+              <w:t>Eiswürfelmodul</w:t>
+            </w:r>
+          </w:p>
+        </w:tc>
+        <w:tc>
+          <w:tcPr>
+            <w:tcW w:type="dxa" w:w="4989"/>
+            <w:vAlign w:val="top"/>
+            <w:tcMar>
+              <w:top w:w="70" w:type="dxa"/>
+              <w:start w:w="70" w:type="dxa"/>
+              <w:bottom w:w="70" w:type="dxa"/>
+              <w:end w:w="70" w:type="dxa"/>
+            </w:tcMar>
+          </w:tcPr>
+          <w:p>
+            <w:r>
+              <w:rPr>
+                <w:rFonts w:ascii="Times New Roman" w:hAnsi="Times New Roman"/>
+                <w:sz w:val="17"/>
+              </w:rPr>
+              <w:t>Mechanik frei; Kalibrierung verlangt Anmeldung in der Mobilanwendung</w:t>
+            </w:r>
+          </w:p>
+        </w:tc>
+      </w:tr>
+      <w:tr>
+        <w:trPr>
+          <w:cantSplit/>
+        </w:trPr>
+        <w:tc>
+          <w:tcPr>
+            <w:tcW w:type="dxa" w:w="1361"/>
+            <w:vAlign w:val="top"/>
+            <w:tcMar>
+              <w:top w:w="70" w:type="dxa"/>
+              <w:start w:w="70" w:type="dxa"/>
+              <w:bottom w:w="70" w:type="dxa"/>
+              <w:end w:w="70" w:type="dxa"/>
+            </w:tcMar>
+          </w:tcPr>
+          <w:p>
+            <w:r>
+              <w:rPr>
+                <w:rFonts w:ascii="Times New Roman" w:hAnsi="Times New Roman"/>
+                <w:sz w:val="17"/>
+              </w:rPr>
+              <w:t>10:37</w:t>
+            </w:r>
+          </w:p>
+        </w:tc>
+        <w:tc>
+          <w:tcPr>
+            <w:tcW w:type="dxa" w:w="2608"/>
+            <w:vAlign w:val="top"/>
+            <w:tcMar>
+              <w:top w:w="70" w:type="dxa"/>
+              <w:start w:w="70" w:type="dxa"/>
+              <w:bottom w:w="70" w:type="dxa"/>
+              <w:end w:w="70" w:type="dxa"/>
+            </w:tcMar>
+          </w:tcPr>
+          <w:p>
+            <w:r>
+              <w:rPr>
+                <w:rFonts w:ascii="Times New Roman" w:hAnsi="Times New Roman"/>
+                <w:sz w:val="17"/>
+              </w:rPr>
+              <w:t>ServicePort</w:t>
+            </w:r>
+          </w:p>
+        </w:tc>
+        <w:tc>
+          <w:tcPr>
+            <w:tcW w:type="dxa" w:w="4989"/>
+            <w:vAlign w:val="top"/>
+            <w:tcMar>
+              <w:top w:w="70" w:type="dxa"/>
+              <w:start w:w="70" w:type="dxa"/>
+              <w:bottom w:w="70" w:type="dxa"/>
+              <w:end w:w="70" w:type="dxa"/>
+            </w:tcMar>
+          </w:tcPr>
+          <w:p>
+            <w:r>
+              <w:rPr>
+                <w:rFonts w:ascii="Times New Roman" w:hAnsi="Times New Roman"/>
+                <w:sz w:val="17"/>
+              </w:rPr>
+              <w:t>Meldung Token refused - authorized service session required</w:t>
+            </w:r>
+          </w:p>
+        </w:tc>
+      </w:tr>
+      <w:tr>
+        <w:trPr>
+          <w:cantSplit/>
+        </w:trPr>
+        <w:tc>
+          <w:tcPr>
+            <w:tcW w:type="dxa" w:w="1361"/>
+            <w:vAlign w:val="top"/>
+            <w:tcMar>
+              <w:top w:w="70" w:type="dxa"/>
+              <w:start w:w="70" w:type="dxa"/>
+              <w:bottom w:w="70" w:type="dxa"/>
+              <w:end w:w="70" w:type="dxa"/>
+            </w:tcMar>
+          </w:tcPr>
+          <w:p>
+            <w:r>
+              <w:rPr>
+                <w:rFonts w:ascii="Times New Roman" w:hAnsi="Times New Roman"/>
+                <w:sz w:val="17"/>
+              </w:rPr>
+              <w:t>10:51</w:t>
+            </w:r>
+          </w:p>
+        </w:tc>
+        <w:tc>
+          <w:tcPr>
+            <w:tcW w:type="dxa" w:w="2608"/>
+            <w:vAlign w:val="top"/>
+            <w:tcMar>
+              <w:top w:w="70" w:type="dxa"/>
+              <w:start w:w="70" w:type="dxa"/>
+              <w:bottom w:w="70" w:type="dxa"/>
+              <w:end w:w="70" w:type="dxa"/>
+            </w:tcMar>
+          </w:tcPr>
+          <w:p>
+            <w:r>
+              <w:rPr>
+                <w:rFonts w:ascii="Times New Roman" w:hAnsi="Times New Roman"/>
+                <w:sz w:val="17"/>
+              </w:rPr>
+              <w:t>Ersatzkompressor VC-CMP-900</w:t>
+            </w:r>
+          </w:p>
+        </w:tc>
+        <w:tc>
+          <w:tcPr>
+            <w:tcW w:type="dxa" w:w="4989"/>
+            <w:vAlign w:val="top"/>
+            <w:tcMar>
+              <w:top w:w="70" w:type="dxa"/>
+              <w:start w:w="70" w:type="dxa"/>
+              <w:bottom w:w="70" w:type="dxa"/>
+              <w:end w:w="70" w:type="dxa"/>
+            </w:tcMar>
+          </w:tcPr>
+          <w:p>
+            <w:r>
+              <w:rPr>
+                <w:rFonts w:ascii="Times New Roman" w:hAnsi="Times New Roman"/>
+                <w:sz w:val="17"/>
+              </w:rPr>
+              <w:t>Bauteil physisch passend; NFC-Pairing ohne freigegebene Sitzung abgewiesen</w:t>
+            </w:r>
+          </w:p>
+        </w:tc>
+      </w:tr>
+    </w:tbl>
+    <w:p/>
+    <w:p>
+      <w:pPr>
+        <w:pStyle w:val="Heading1"/>
+      </w:pPr>
+      <w:r>
+        <w:t>3. Nicht ausgeführte Arbeiten</w:t>
       </w:r>
     </w:p>
     <w:p>
       <w:r>
-        <w:t>Mechanische Reparatur erscheint möglich; digitales Freischaltproblem verhindert Abschluss.</w:t>
+        <w:t>Der Kompressor wurde nicht ausgebaut und das Gerät nicht auf Werkseinstellungen zurückgesetzt. Ohne autorisierte Sitzung bestand das Risiko, dass ein eingebautes Ersatzteil nicht freigeschaltet wird und der bisherige Diagnosezustand verloren geht. Ein Eingriff in die Cloud- oder App-Konfiguration war nicht beauftragt und technisch nicht möglich.</w:t>
+      </w:r>
+    </w:p>
+    <w:p>
+      <w:pPr>
+        <w:pStyle w:val="Heading1"/>
+      </w:pPr>
+      <w:r>
+        <w:t>4. Abrechnung und Rückgabe</w:t>
+      </w:r>
+    </w:p>
+    <w:tbl>
+      <w:tblPr>
+        <w:tblStyle w:val="TableGrid"/>
+        <w:tblW w:type="auto" w:w="0"/>
+        <w:jc w:val="center"/>
+        <w:tblLayout w:type="fixed"/>
+        <w:tblLook w:firstColumn="1" w:firstRow="1" w:lastColumn="0" w:lastRow="0" w:noHBand="0" w:noVBand="1" w:val="04A0"/>
+      </w:tblPr>
+      <w:tblGrid>
+        <w:gridCol w:w="3175"/>
+        <w:gridCol w:w="3175"/>
+        <w:gridCol w:w="3175"/>
+      </w:tblGrid>
+      <w:tr>
+        <w:trPr>
+          <w:tblHeader w:val="true"/>
+        </w:trPr>
+        <w:tc>
+          <w:tcPr>
+            <w:tcW w:type="dxa" w:w="4649"/>
+            <w:vAlign w:val="center"/>
+            <w:shd w:fill="DCE6EC"/>
+            <w:tcMar>
+              <w:top w:w="70" w:type="dxa"/>
+              <w:start w:w="70" w:type="dxa"/>
+              <w:bottom w:w="70" w:type="dxa"/>
+              <w:end w:w="70" w:type="dxa"/>
+            </w:tcMar>
+          </w:tcPr>
+          <w:p>
+            <w:r>
+              <w:rPr>
+                <w:rFonts w:ascii="Times New Roman" w:hAnsi="Times New Roman"/>
+                <w:b/>
+                <w:sz w:val="17"/>
+              </w:rPr>
+              <w:t>Position</w:t>
+            </w:r>
+          </w:p>
+        </w:tc>
+        <w:tc>
+          <w:tcPr>
+            <w:tcW w:type="dxa" w:w="1701"/>
+            <w:vAlign w:val="center"/>
+            <w:shd w:fill="DCE6EC"/>
+            <w:tcMar>
+              <w:top w:w="70" w:type="dxa"/>
+              <w:start w:w="70" w:type="dxa"/>
+              <w:bottom w:w="70" w:type="dxa"/>
+              <w:end w:w="70" w:type="dxa"/>
+            </w:tcMar>
+          </w:tcPr>
+          <w:p>
+            <w:r>
+              <w:rPr>
+                <w:rFonts w:ascii="Times New Roman" w:hAnsi="Times New Roman"/>
+                <w:b/>
+                <w:sz w:val="17"/>
+              </w:rPr>
+              <w:t>Menge</w:t>
+            </w:r>
+          </w:p>
+        </w:tc>
+        <w:tc>
+          <w:tcPr>
+            <w:tcW w:type="dxa" w:w="2608"/>
+            <w:vAlign w:val="center"/>
+            <w:shd w:fill="DCE6EC"/>
+            <w:tcMar>
+              <w:top w:w="70" w:type="dxa"/>
+              <w:start w:w="70" w:type="dxa"/>
+              <w:bottom w:w="70" w:type="dxa"/>
+              <w:end w:w="70" w:type="dxa"/>
+            </w:tcMar>
+          </w:tcPr>
+          <w:p>
+            <w:r>
+              <w:rPr>
+                <w:rFonts w:ascii="Times New Roman" w:hAnsi="Times New Roman"/>
+                <w:b/>
+                <w:sz w:val="17"/>
+              </w:rPr>
+              <w:t>Betrag</w:t>
+            </w:r>
+          </w:p>
+        </w:tc>
+      </w:tr>
+      <w:tr>
+        <w:trPr>
+          <w:cantSplit/>
+        </w:trPr>
+        <w:tc>
+          <w:tcPr>
+            <w:tcW w:type="dxa" w:w="4649"/>
+            <w:vAlign w:val="top"/>
+            <w:tcMar>
+              <w:top w:w="70" w:type="dxa"/>
+              <w:start w:w="70" w:type="dxa"/>
+              <w:bottom w:w="70" w:type="dxa"/>
+              <w:end w:w="70" w:type="dxa"/>
+            </w:tcMar>
+          </w:tcPr>
+          <w:p>
+            <w:r>
+              <w:rPr>
+                <w:rFonts w:ascii="Times New Roman" w:hAnsi="Times New Roman"/>
+                <w:sz w:val="17"/>
+              </w:rPr>
+              <w:t>Anfahrt Köln-Nippes bis Rheinufer</w:t>
+            </w:r>
+          </w:p>
+        </w:tc>
+        <w:tc>
+          <w:tcPr>
+            <w:tcW w:type="dxa" w:w="1701"/>
+            <w:vAlign w:val="top"/>
+            <w:tcMar>
+              <w:top w:w="70" w:type="dxa"/>
+              <w:start w:w="70" w:type="dxa"/>
+              <w:bottom w:w="70" w:type="dxa"/>
+              <w:end w:w="70" w:type="dxa"/>
+            </w:tcMar>
+          </w:tcPr>
+          <w:p>
+            <w:r>
+              <w:rPr>
+                <w:rFonts w:ascii="Times New Roman" w:hAnsi="Times New Roman"/>
+                <w:sz w:val="17"/>
+              </w:rPr>
+              <w:t>1</w:t>
+            </w:r>
+          </w:p>
+        </w:tc>
+        <w:tc>
+          <w:tcPr>
+            <w:tcW w:type="dxa" w:w="2608"/>
+            <w:vAlign w:val="top"/>
+            <w:tcMar>
+              <w:top w:w="70" w:type="dxa"/>
+              <w:start w:w="70" w:type="dxa"/>
+              <w:bottom w:w="70" w:type="dxa"/>
+              <w:end w:w="70" w:type="dxa"/>
+            </w:tcMar>
+          </w:tcPr>
+          <w:p>
+            <w:r>
+              <w:rPr>
+                <w:rFonts w:ascii="Times New Roman" w:hAnsi="Times New Roman"/>
+                <w:sz w:val="17"/>
+              </w:rPr>
+              <w:t>38,00 EUR</w:t>
+            </w:r>
+          </w:p>
+        </w:tc>
+      </w:tr>
+      <w:tr>
+        <w:trPr>
+          <w:cantSplit/>
+        </w:trPr>
+        <w:tc>
+          <w:tcPr>
+            <w:tcW w:type="dxa" w:w="4649"/>
+            <w:vAlign w:val="top"/>
+            <w:tcMar>
+              <w:top w:w="70" w:type="dxa"/>
+              <w:start w:w="70" w:type="dxa"/>
+              <w:bottom w:w="70" w:type="dxa"/>
+              <w:end w:w="70" w:type="dxa"/>
+            </w:tcMar>
+          </w:tcPr>
+          <w:p>
+            <w:r>
+              <w:rPr>
+                <w:rFonts w:ascii="Times New Roman" w:hAnsi="Times New Roman"/>
+                <w:sz w:val="17"/>
+              </w:rPr>
+              <w:t>Fehlerdiagnose und Messung</w:t>
+            </w:r>
+          </w:p>
+        </w:tc>
+        <w:tc>
+          <w:tcPr>
+            <w:tcW w:type="dxa" w:w="1701"/>
+            <w:vAlign w:val="top"/>
+            <w:tcMar>
+              <w:top w:w="70" w:type="dxa"/>
+              <w:start w:w="70" w:type="dxa"/>
+              <w:bottom w:w="70" w:type="dxa"/>
+              <w:end w:w="70" w:type="dxa"/>
+            </w:tcMar>
+          </w:tcPr>
+          <w:p>
+            <w:r>
+              <w:rPr>
+                <w:rFonts w:ascii="Times New Roman" w:hAnsi="Times New Roman"/>
+                <w:sz w:val="17"/>
+              </w:rPr>
+              <w:t>1,5 Stunden</w:t>
+            </w:r>
+          </w:p>
+        </w:tc>
+        <w:tc>
+          <w:tcPr>
+            <w:tcW w:type="dxa" w:w="2608"/>
+            <w:vAlign w:val="top"/>
+            <w:tcMar>
+              <w:top w:w="70" w:type="dxa"/>
+              <w:start w:w="70" w:type="dxa"/>
+              <w:bottom w:w="70" w:type="dxa"/>
+              <w:end w:w="70" w:type="dxa"/>
+            </w:tcMar>
+          </w:tcPr>
+          <w:p>
+            <w:r>
+              <w:rPr>
+                <w:rFonts w:ascii="Times New Roman" w:hAnsi="Times New Roman"/>
+                <w:sz w:val="17"/>
+              </w:rPr>
+              <w:t>126,00 EUR</w:t>
+            </w:r>
+          </w:p>
+        </w:tc>
+      </w:tr>
+      <w:tr>
+        <w:trPr>
+          <w:cantSplit/>
+        </w:trPr>
+        <w:tc>
+          <w:tcPr>
+            <w:tcW w:type="dxa" w:w="4649"/>
+            <w:vAlign w:val="top"/>
+            <w:tcMar>
+              <w:top w:w="70" w:type="dxa"/>
+              <w:start w:w="70" w:type="dxa"/>
+              <w:bottom w:w="70" w:type="dxa"/>
+              <w:end w:w="70" w:type="dxa"/>
+            </w:tcMar>
+          </w:tcPr>
+          <w:p>
+            <w:r>
+              <w:rPr>
+                <w:rFonts w:ascii="Times New Roman" w:hAnsi="Times New Roman"/>
+                <w:sz w:val="17"/>
+              </w:rPr>
+              <w:t>Kleinmaterial und Messprotokoll</w:t>
+            </w:r>
+          </w:p>
+        </w:tc>
+        <w:tc>
+          <w:tcPr>
+            <w:tcW w:type="dxa" w:w="1701"/>
+            <w:vAlign w:val="top"/>
+            <w:tcMar>
+              <w:top w:w="70" w:type="dxa"/>
+              <w:start w:w="70" w:type="dxa"/>
+              <w:bottom w:w="70" w:type="dxa"/>
+              <w:end w:w="70" w:type="dxa"/>
+            </w:tcMar>
+          </w:tcPr>
+          <w:p>
+            <w:r>
+              <w:rPr>
+                <w:rFonts w:ascii="Times New Roman" w:hAnsi="Times New Roman"/>
+                <w:sz w:val="17"/>
+              </w:rPr>
+              <w:t>1</w:t>
+            </w:r>
+          </w:p>
+        </w:tc>
+        <w:tc>
+          <w:tcPr>
+            <w:tcW w:type="dxa" w:w="2608"/>
+            <w:vAlign w:val="top"/>
+            <w:tcMar>
+              <w:top w:w="70" w:type="dxa"/>
+              <w:start w:w="70" w:type="dxa"/>
+              <w:bottom w:w="70" w:type="dxa"/>
+              <w:end w:w="70" w:type="dxa"/>
+            </w:tcMar>
+          </w:tcPr>
+          <w:p>
+            <w:r>
+              <w:rPr>
+                <w:rFonts w:ascii="Times New Roman" w:hAnsi="Times New Roman"/>
+                <w:sz w:val="17"/>
+              </w:rPr>
+              <w:t>14,50 EUR</w:t>
+            </w:r>
+          </w:p>
+        </w:tc>
+      </w:tr>
+      <w:tr>
+        <w:trPr>
+          <w:cantSplit/>
+        </w:trPr>
+        <w:tc>
+          <w:tcPr>
+            <w:tcW w:type="dxa" w:w="4649"/>
+            <w:vAlign w:val="top"/>
+            <w:tcMar>
+              <w:top w:w="70" w:type="dxa"/>
+              <w:start w:w="70" w:type="dxa"/>
+              <w:bottom w:w="70" w:type="dxa"/>
+              <w:end w:w="70" w:type="dxa"/>
+            </w:tcMar>
+          </w:tcPr>
+          <w:p>
+            <w:r>
+              <w:rPr>
+                <w:rFonts w:ascii="Times New Roman" w:hAnsi="Times New Roman"/>
+                <w:sz w:val="17"/>
+              </w:rPr>
+              <w:t>Gesamtbetrag</w:t>
+            </w:r>
+          </w:p>
+        </w:tc>
+        <w:tc>
+          <w:tcPr>
+            <w:tcW w:type="dxa" w:w="1701"/>
+            <w:vAlign w:val="top"/>
+            <w:tcMar>
+              <w:top w:w="70" w:type="dxa"/>
+              <w:start w:w="70" w:type="dxa"/>
+              <w:bottom w:w="70" w:type="dxa"/>
+              <w:end w:w="70" w:type="dxa"/>
+            </w:tcMar>
+          </w:tcPr>
+          <w:p>
+            <w:r>
+              <w:rPr>
+                <w:rFonts w:ascii="Times New Roman" w:hAnsi="Times New Roman"/>
+                <w:sz w:val="17"/>
+              </w:rPr>
+            </w:r>
+          </w:p>
+        </w:tc>
+        <w:tc>
+          <w:tcPr>
+            <w:tcW w:type="dxa" w:w="2608"/>
+            <w:vAlign w:val="top"/>
+            <w:tcMar>
+              <w:top w:w="70" w:type="dxa"/>
+              <w:start w:w="70" w:type="dxa"/>
+              <w:bottom w:w="70" w:type="dxa"/>
+              <w:end w:w="70" w:type="dxa"/>
+            </w:tcMar>
+          </w:tcPr>
+          <w:p>
+            <w:r>
+              <w:rPr>
+                <w:rFonts w:ascii="Times New Roman" w:hAnsi="Times New Roman"/>
+                <w:sz w:val="17"/>
+              </w:rPr>
+              <w:t>178,50 EUR</w:t>
+            </w:r>
+          </w:p>
+        </w:tc>
+      </w:tr>
+    </w:tbl>
+    <w:p/>
+    <w:p>
+      <w:r>
+        <w:t>Das Gerät blieb angeschlossen. Der Kundin wurde empfohlen, Händler und Hersteller um einen autorisierten Servicetermin oder um Freigabe des Diagnosezugangs zu bitten. Das Protokoll dokumentiert ausschließlich die am 3. Mai 2026 festgestellten technischen Tatsachen.</w:t>
+      </w:r>
+    </w:p>
+    <w:p>
+      <w:r>
+        <w:t>Köln, 3. Mai 2026</w:t>
+        <w:br/>
+        <w:br/>
+        <w:t>Gregor Pütz</w:t>
+        <w:br/>
+        <w:t>Kälteanlagenbauermeister</w:t>
       </w:r>
     </w:p>
     <w:sectPr>
-      <w:pgSz w:w="12240" w:h="15840"/>
-      <w:pgMar w:top="1440" w:right="1800" w:bottom="1440" w:left="1800" w:header="720" w:footer="720" w:gutter="0"/>
+      <w:footerReference w:type="default" r:id="rId9"/>
+      <w:pgSz w:w="11906" w:h="16838"/>
+      <w:pgMar w:top="1020" w:right="1134" w:bottom="964" w:left="1247" w:header="720" w:footer="720" w:gutter="0"/>
       <w:cols w:space="720"/>
       <w:docGrid w:linePitch="360"/>
     </w:sectPr>
   </w:body>
 </w:document>
+</file>
+
+<file path=word/footer1.xml><?xml version="1.0" encoding="utf-8"?>
+<w:ftr xmlns:m="http://schemas.openxmlformats.org/officeDocument/2006/math" xmlns:mc="http://schemas.openxmlformats.org/markup-compatibility/2006" xmlns:mo="http://schemas.microsoft.com/office/mac/office/2008/main" xmlns:mv="urn:schemas-microsoft-com:mac:vml" xmlns:o="urn:schemas-microsoft-com:office:office" xmlns:r="http://schemas.openxmlformats.org/officeDocument/2006/relationships" xmlns:v="urn:schemas-microsoft-com:vml" xmlns:w10="urn:schemas-microsoft-com:office:word" xmlns:w14="http://schemas.microsoft.com/office/word/2010/wordml" xmlns:w="http://schemas.openxmlformats.org/wordprocessingml/2006/main" xmlns:wne="http://schemas.microsoft.com/office/word/2006/wordml" xmlns:wp14="http://schemas.microsoft.com/office/word/2010/wordprocessingDrawing" xmlns:wp="http://schemas.openxmlformats.org/drawingml/2006/wordprocessingDrawing" xmlns:wpc="http://schemas.microsoft.com/office/word/2010/wordprocessingCanvas" xmlns:wpg="http://schemas.microsoft.com/office/word/2010/wordprocessingGroup" xmlns:wpi="http://schemas.microsoft.com/office/word/2010/wordprocessingInk" xmlns:wps="http://schemas.microsoft.com/office/word/2010/wordprocessingShape" mc:Ignorable="w14 wp14">
+  <w:p>
+    <w:pPr>
+      <w:pStyle w:val="Footer"/>
+      <w:jc w:val="center"/>
+    </w:pPr>
+    <w:r>
+      <w:rPr>
+        <w:rFonts w:ascii="Times New Roman" w:hAnsi="Times New Roman"/>
+        <w:color w:val="5F5F5F"/>
+        <w:sz w:val="16"/>
+      </w:rPr>
+      <w:t xml:space="preserve">Kundendienstauftrag KP 26-0503-17 | VestaCool FR-900 | </w:t>
+    </w:r>
+    <w:r>
+      <w:rPr>
+        <w:rFonts w:ascii="Times New Roman" w:hAnsi="Times New Roman"/>
+        <w:color w:val="5F5F5F"/>
+        <w:sz w:val="16"/>
+      </w:rPr>
+      <w:t xml:space="preserve">Seite </w:t>
+    </w:r>
+    <w:r>
+      <w:rPr>
+        <w:rFonts w:ascii="Times New Roman" w:hAnsi="Times New Roman"/>
+        <w:color w:val="5F5F5F"/>
+        <w:sz w:val="16"/>
+      </w:rPr>
+      <w:fldChar w:fldCharType="begin"/>
+      <w:instrText xml:space="preserve"> PAGE </w:instrText>
+      <w:fldChar w:fldCharType="end"/>
+    </w:r>
+  </w:p>
+</w:ftr>
 </file>
 
 <file path=word/numbering.xml><?xml version="1.0" encoding="utf-8"?>
@@ -393,6 +1672,13 @@
     <w:name w:val="Normal"/>
     <w:qFormat/>
     <w:rsid w:val="00FC693F"/>
+    <w:pPr>
+      <w:spacing w:after="120" w:line="259" w:lineRule="auto"/>
+    </w:pPr>
+    <w:rPr>
+      <w:rFonts w:ascii="Times New Roman" w:hAnsi="Times New Roman"/>
+      <w:sz w:val="22"/>
+    </w:rPr>
   </w:style>
   <w:style w:type="paragraph" w:styleId="Header">
     <w:name w:val="header"/>
@@ -449,15 +1735,15 @@
     <w:pPr>
       <w:keepNext/>
       <w:keepLines/>
-      <w:spacing w:before="480" w:after="0"/>
+      <w:spacing w:before="180" w:after="80"/>
       <w:outlineLvl w:val="0"/>
     </w:pPr>
     <w:rPr>
-      <w:rFonts w:asciiTheme="majorHAnsi" w:eastAsiaTheme="majorEastAsia" w:hAnsiTheme="majorHAnsi" w:cstheme="majorBidi"/>
+      <w:rFonts w:asciiTheme="majorHAnsi" w:eastAsiaTheme="majorEastAsia" w:hAnsiTheme="majorHAnsi" w:cstheme="majorBidi" w:ascii="Times New Roman" w:hAnsi="Times New Roman"/>
       <w:b/>
       <w:bCs/>
-      <w:color w:val="365F91" w:themeColor="accent1" w:themeShade="BF"/>
-      <w:sz w:val="28"/>
+      <w:color w:val="23364D"/>
+      <w:sz w:val="26"/>
       <w:szCs w:val="28"/>
     </w:rPr>
   </w:style>
@@ -473,15 +1759,15 @@
     <w:pPr>
       <w:keepNext/>
       <w:keepLines/>
-      <w:spacing w:before="200" w:after="0"/>
+      <w:spacing w:before="180" w:after="80"/>
       <w:outlineLvl w:val="1"/>
     </w:pPr>
     <w:rPr>
-      <w:rFonts w:asciiTheme="majorHAnsi" w:eastAsiaTheme="majorEastAsia" w:hAnsiTheme="majorHAnsi" w:cstheme="majorBidi"/>
+      <w:rFonts w:asciiTheme="majorHAnsi" w:eastAsiaTheme="majorEastAsia" w:hAnsiTheme="majorHAnsi" w:cstheme="majorBidi" w:ascii="Times New Roman" w:hAnsi="Times New Roman"/>
       <w:b/>
       <w:bCs/>
-      <w:color w:val="4F81BD" w:themeColor="accent1"/>
-      <w:sz w:val="26"/>
+      <w:color w:val="23364D"/>
+      <w:sz w:val="23"/>
       <w:szCs w:val="26"/>
     </w:rPr>
   </w:style>
@@ -738,15 +2024,16 @@
       <w:pBdr>
         <w:bottom w:val="single" w:sz="8" w:space="4" w:color="4F81BD" w:themeColor="accent1"/>
       </w:pBdr>
-      <w:spacing w:after="300" w:line="240" w:lineRule="auto"/>
+      <w:spacing w:after="80" w:line="240" w:lineRule="auto" w:before="180"/>
       <w:contextualSpacing/>
     </w:pPr>
     <w:rPr>
-      <w:rFonts w:asciiTheme="majorHAnsi" w:eastAsiaTheme="majorEastAsia" w:hAnsiTheme="majorHAnsi" w:cstheme="majorBidi"/>
-      <w:color w:val="17365D" w:themeColor="text2" w:themeShade="BF"/>
+      <w:rFonts w:asciiTheme="majorHAnsi" w:eastAsiaTheme="majorEastAsia" w:hAnsiTheme="majorHAnsi" w:cstheme="majorBidi" w:ascii="Times New Roman" w:hAnsi="Times New Roman"/>
+      <w:b/>
+      <w:color w:val="23364D"/>
       <w:spacing w:val="5"/>
       <w:kern w:val="28"/>
-      <w:sz w:val="52"/>
+      <w:sz w:val="32"/>
       <w:szCs w:val="52"/>
     </w:rPr>
   </w:style>

</xml_diff>